<commit_message>
Upload “src/content/bios/Wyndham White-E 2012.docx”
</commit_message>
<xml_diff>
--- a/src/content/bios/Wyndham White-E 2012.docx
+++ b/src/content/bios/Wyndham White-E 2012.docx
@@ -1,6 +1,6 @@
 
 <file path=word/document.xml><?xml version="1.0" encoding="utf-8"?>
-<w:document xmlns:wpc="http://schemas.microsoft.com/office/word/2010/wordprocessingCanvas" xmlns:cx="http://schemas.microsoft.com/office/drawing/2014/chartex" xmlns:cx1="http://schemas.microsoft.com/office/drawing/2015/9/8/chartex" xmlns:cx2="http://schemas.microsoft.com/office/drawing/2015/10/21/chartex" xmlns:cx3="http://schemas.microsoft.com/office/drawing/2016/5/9/chartex" xmlns:cx4="http://schemas.microsoft.com/office/drawing/2016/5/10/chartex" xmlns:cx5="http://schemas.microsoft.com/office/drawing/2016/5/11/chartex" xmlns:cx6="http://schemas.microsoft.com/office/drawing/2016/5/12/chartex" xmlns:cx7="http://schemas.microsoft.com/office/drawing/2016/5/13/chartex" xmlns:cx8="http://schemas.microsoft.com/office/drawing/2016/5/14/chartex" xmlns:mc="http://schemas.openxmlformats.org/markup-compatibility/2006" xmlns:aink="http://schemas.microsoft.com/office/drawing/2016/ink" xmlns:am3d="http://schemas.microsoft.com/office/drawing/2017/model3d" xmlns:o="urn:schemas-microsoft-com:office:office" xmlns:oel="http://schemas.microsoft.com/office/2019/extlst" xmlns:r="http://schemas.openxmlformats.org/officeDocument/2006/relationships" xmlns:m="http://schemas.openxmlformats.org/officeDocument/2006/math" xmlns:v="urn:schemas-microsoft-com:vml" xmlns:wp14="http://schemas.microsoft.com/office/word/2010/wordprocessingDrawing" xmlns:wp="http://schemas.openxmlformats.org/drawingml/2006/wordprocessingDrawing" xmlns:w10="urn:schemas-microsoft-com:office:word" xmlns:w="http://schemas.openxmlformats.org/wordprocessingml/2006/main" xmlns:w14="http://schemas.microsoft.com/office/word/2010/wordml" xmlns:w15="http://schemas.microsoft.com/office/word/2012/wordml" xmlns:w16cex="http://schemas.microsoft.com/office/word/2018/wordml/cex" xmlns:w16cid="http://schemas.microsoft.com/office/word/2016/wordml/cid" xmlns:w16="http://schemas.microsoft.com/office/word/2018/wordml" xmlns:w16du="http://schemas.microsoft.com/office/word/2023/wordml/word16du" xmlns:w16sdtdh="http://schemas.microsoft.com/office/word/2020/wordml/sdtdatahash" xmlns:w16sdtfl="http://schemas.microsoft.com/office/word/2024/wordml/sdtformatlock" xmlns:w16se="http://schemas.microsoft.com/office/word/2015/wordml/symex" xmlns:wpg="http://schemas.microsoft.com/office/word/2010/wordprocessingGroup" xmlns:wpi="http://schemas.microsoft.com/office/word/2010/wordprocessingInk" xmlns:wne="http://schemas.microsoft.com/office/word/2006/wordml" xmlns:wps="http://schemas.microsoft.com/office/word/2010/wordprocessingShape" mc:Ignorable="w14 w15 w16se w16cid w16 w16cex w16sdtdh w16sdtfl w16du wp14">
+<w:document xmlns:wpc="http://schemas.microsoft.com/office/word/2010/wordprocessingCanvas" xmlns:cx="http://schemas.microsoft.com/office/drawing/2014/chartex" xmlns:cx1="http://schemas.microsoft.com/office/drawing/2015/9/8/chartex" xmlns:cx2="http://schemas.microsoft.com/office/drawing/2015/10/21/chartex" xmlns:cx3="http://schemas.microsoft.com/office/drawing/2016/5/9/chartex" xmlns:cx4="http://schemas.microsoft.com/office/drawing/2016/5/10/chartex" xmlns:cx5="http://schemas.microsoft.com/office/drawing/2016/5/11/chartex" xmlns:cx6="http://schemas.microsoft.com/office/drawing/2016/5/12/chartex" xmlns:cx7="http://schemas.microsoft.com/office/drawing/2016/5/13/chartex" xmlns:cx8="http://schemas.microsoft.com/office/drawing/2016/5/14/chartex" xmlns:mc="http://schemas.openxmlformats.org/markup-compatibility/2006" xmlns:m="http://schemas.openxmlformats.org/officeDocument/2006/math" xmlns:aink="http://schemas.microsoft.com/office/drawing/2016/ink" xmlns:am3d="http://schemas.microsoft.com/office/drawing/2017/model3d" xmlns:oel="http://schemas.microsoft.com/office/2019/extlst" xmlns:r="http://schemas.openxmlformats.org/officeDocument/2006/relationships" xmlns:wp14="http://schemas.microsoft.com/office/word/2010/wordprocessingDrawing" xmlns:wp="http://schemas.openxmlformats.org/drawingml/2006/wordprocessingDrawing" xmlns:wpg="http://schemas.microsoft.com/office/word/2010/wordprocessingGroup" xmlns:wpi="http://schemas.microsoft.com/office/word/2010/wordprocessingInk" xmlns:wps="http://schemas.microsoft.com/office/word/2010/wordprocessingShape" xmlns:o="urn:schemas-microsoft-com:office:office" xmlns:v="urn:schemas-microsoft-com:vml" xmlns:w10="urn:schemas-microsoft-com:office:word" xmlns:w="http://schemas.openxmlformats.org/wordprocessingml/2006/main" xmlns:w14="http://schemas.microsoft.com/office/word/2010/wordml" xmlns:w15="http://schemas.microsoft.com/office/word/2012/wordml" xmlns:w16cei="http://schemas.microsoft.com/office/word/2026/wordml/cei" xmlns:w16cex="http://schemas.microsoft.com/office/word/2018/wordml/cex" xmlns:w16cid="http://schemas.microsoft.com/office/word/2016/wordml/cid" xmlns:w16="http://schemas.microsoft.com/office/word/2018/wordml" xmlns:w16sdtdh="http://schemas.microsoft.com/office/word/2020/wordml/sdtdatahash" xmlns:w16sdtfl="http://schemas.microsoft.com/office/word/2024/wordml/sdtformatlock" xmlns:w16se="http://schemas.microsoft.com/office/word/2015/wordml/symex" xmlns:w16du="http://schemas.microsoft.com/office/word/2023/wordml/word16du" xmlns:wne="http://schemas.microsoft.com/office/word/2006/wordml" mc:Ignorable="w14 w15 w16se w16cid w16 w16cex w16sdtdh w16sdtfl w16du wp14">
   <w:body>
     <w:p>
       <w:pPr>
@@ -14,7 +14,517 @@
         </w:rPr>
       </w:pPr>
       <w:r>
-        <w:t xml:space="preserve">WYNDHAM WHITE, Eric Henry, British civil servant, first Executive Secretary of the General Agreement on Tariffs and Trade (GATT) 1948-1965 and Director-General of the General Agreement on Tariffs and Trade (GATT) 1965-1968, was born on 26 January 1913 in London, United Kingdom, and died on 27 January 1980 in Ferney-Voltaire, France. He was the son of Henry Wyndham White, barrister-at-law, and Helen Peppiatt. On 12 November 1947 he married Tina Gibson, American actress (professional name Tina Thayer), in New York City. They had two daughters and divorced after 1964.</w:t>
+        <w:rPr>
+          <w:rFonts w:ascii="Times New Roman" w:hAnsi="Times New Roman" w:cs="Times New Roman"/>
+          <w:b/>
+          <w:sz w:val="24"/>
+          <w:szCs w:val="24"/>
+        </w:rPr>
+        <w:t xml:space="preserve">WYNDHAM </w:t>
+      </w:r>
+      <w:r>
+        <w:rPr>
+          <w:rFonts w:ascii="Times New Roman" w:hAnsi="Times New Roman" w:cs="Times New Roman"/>
+          <w:b/>
+          <w:sz w:val="24"/>
+          <w:szCs w:val="24"/>
+        </w:rPr>
+        <w:t>WHITE, Eric</w:t>
+      </w:r>
+      <w:r>
+        <w:rPr>
+          <w:rFonts w:ascii="Times New Roman" w:hAnsi="Times New Roman" w:cs="Times New Roman"/>
+          <w:b/>
+          <w:sz w:val="24"/>
+          <w:szCs w:val="24"/>
+        </w:rPr>
+        <w:t xml:space="preserve"> </w:t>
+      </w:r>
+      <w:r>
+        <w:rPr>
+          <w:rFonts w:ascii="Times New Roman" w:hAnsi="Times New Roman" w:cs="Times New Roman"/>
+          <w:b/>
+          <w:sz w:val="24"/>
+          <w:szCs w:val="24"/>
+        </w:rPr>
+        <w:t>Henry</w:t>
+      </w:r>
+      <w:r>
+        <w:rPr>
+          <w:rFonts w:ascii="Times New Roman" w:hAnsi="Times New Roman" w:cs="Times New Roman"/>
+          <w:b/>
+          <w:sz w:val="24"/>
+          <w:szCs w:val="24"/>
+        </w:rPr>
+        <w:t xml:space="preserve">, British </w:t>
+      </w:r>
+      <w:r>
+        <w:rPr>
+          <w:rFonts w:ascii="Times New Roman" w:hAnsi="Times New Roman" w:cs="Times New Roman"/>
+          <w:b/>
+          <w:sz w:val="24"/>
+          <w:szCs w:val="24"/>
+        </w:rPr>
+        <w:t>civil servant</w:t>
+      </w:r>
+      <w:r>
+        <w:rPr>
+          <w:rFonts w:ascii="Times New Roman" w:hAnsi="Times New Roman" w:cs="Times New Roman"/>
+          <w:b/>
+          <w:sz w:val="24"/>
+          <w:szCs w:val="24"/>
+        </w:rPr>
+        <w:t>,</w:t>
+      </w:r>
+      <w:r>
+        <w:rPr>
+          <w:rFonts w:ascii="Times New Roman" w:hAnsi="Times New Roman" w:cs="Times New Roman"/>
+          <w:b/>
+          <w:sz w:val="24"/>
+          <w:szCs w:val="24"/>
+        </w:rPr>
+        <w:t xml:space="preserve"> first</w:t>
+      </w:r>
+      <w:r>
+        <w:rPr>
+          <w:rFonts w:ascii="Times New Roman" w:hAnsi="Times New Roman" w:cs="Times New Roman"/>
+          <w:b/>
+          <w:sz w:val="24"/>
+          <w:szCs w:val="24"/>
+        </w:rPr>
+        <w:t xml:space="preserve"> Executive </w:t>
+      </w:r>
+      <w:r>
+        <w:rPr>
+          <w:rFonts w:ascii="Times New Roman" w:hAnsi="Times New Roman" w:cs="Times New Roman"/>
+          <w:b/>
+          <w:sz w:val="24"/>
+          <w:szCs w:val="24"/>
+        </w:rPr>
+        <w:t>S</w:t>
+      </w:r>
+      <w:r>
+        <w:rPr>
+          <w:rFonts w:ascii="Times New Roman" w:hAnsi="Times New Roman" w:cs="Times New Roman"/>
+          <w:b/>
+          <w:sz w:val="24"/>
+          <w:szCs w:val="24"/>
+        </w:rPr>
+        <w:t xml:space="preserve">ecretary </w:t>
+      </w:r>
+      <w:r>
+        <w:rPr>
+          <w:rFonts w:ascii="Times New Roman" w:hAnsi="Times New Roman" w:cs="Times New Roman"/>
+          <w:b/>
+          <w:sz w:val="24"/>
+          <w:szCs w:val="24"/>
+        </w:rPr>
+        <w:t>of the General Agreement on Tariffs and Trade (GATT)</w:t>
+      </w:r>
+      <w:r>
+        <w:rPr>
+          <w:rFonts w:ascii="Times New Roman" w:hAnsi="Times New Roman" w:cs="Times New Roman"/>
+          <w:b/>
+          <w:sz w:val="24"/>
+          <w:szCs w:val="24"/>
+        </w:rPr>
+        <w:t xml:space="preserve"> </w:t>
+      </w:r>
+      <w:r>
+        <w:rPr>
+          <w:rFonts w:ascii="Times New Roman" w:hAnsi="Times New Roman" w:cs="Times New Roman"/>
+          <w:b/>
+          <w:sz w:val="24"/>
+          <w:szCs w:val="24"/>
+        </w:rPr>
+        <w:t>1948-</w:t>
+      </w:r>
+      <w:r>
+        <w:rPr>
+          <w:rFonts w:ascii="Times New Roman" w:hAnsi="Times New Roman" w:cs="Times New Roman"/>
+          <w:b/>
+          <w:sz w:val="24"/>
+          <w:szCs w:val="24"/>
+        </w:rPr>
+        <w:t>19</w:t>
+      </w:r>
+      <w:r>
+        <w:rPr>
+          <w:rFonts w:ascii="Times New Roman" w:hAnsi="Times New Roman" w:cs="Times New Roman"/>
+          <w:b/>
+          <w:sz w:val="24"/>
+          <w:szCs w:val="24"/>
+        </w:rPr>
+        <w:t xml:space="preserve">65 </w:t>
+      </w:r>
+      <w:r>
+        <w:rPr>
+          <w:rFonts w:ascii="Times New Roman" w:hAnsi="Times New Roman" w:cs="Times New Roman"/>
+          <w:b/>
+          <w:sz w:val="24"/>
+          <w:szCs w:val="24"/>
+        </w:rPr>
+        <w:t>and</w:t>
+      </w:r>
+      <w:r>
+        <w:rPr>
+          <w:rFonts w:ascii="Times New Roman" w:hAnsi="Times New Roman" w:cs="Times New Roman"/>
+          <w:b/>
+          <w:sz w:val="24"/>
+          <w:szCs w:val="24"/>
+        </w:rPr>
+        <w:t xml:space="preserve"> Director-General </w:t>
+      </w:r>
+      <w:r>
+        <w:rPr>
+          <w:rFonts w:ascii="Times New Roman" w:hAnsi="Times New Roman" w:cs="Times New Roman"/>
+          <w:b/>
+          <w:sz w:val="24"/>
+          <w:szCs w:val="24"/>
+        </w:rPr>
+        <w:t>of the General Agreement on Tariffs and Trade (GATT)</w:t>
+      </w:r>
+      <w:r>
+        <w:rPr>
+          <w:rFonts w:ascii="Times New Roman" w:hAnsi="Times New Roman" w:cs="Times New Roman"/>
+          <w:b/>
+          <w:sz w:val="24"/>
+          <w:szCs w:val="24"/>
+        </w:rPr>
+        <w:t xml:space="preserve"> </w:t>
+      </w:r>
+      <w:r>
+        <w:rPr>
+          <w:rFonts w:ascii="Times New Roman" w:hAnsi="Times New Roman" w:cs="Times New Roman"/>
+          <w:b/>
+          <w:sz w:val="24"/>
+          <w:szCs w:val="24"/>
+        </w:rPr>
+        <w:t>1965-</w:t>
+      </w:r>
+      <w:r>
+        <w:rPr>
+          <w:rFonts w:ascii="Times New Roman" w:hAnsi="Times New Roman" w:cs="Times New Roman"/>
+          <w:b/>
+          <w:sz w:val="24"/>
+          <w:szCs w:val="24"/>
+        </w:rPr>
+        <w:t>19</w:t>
+      </w:r>
+      <w:r>
+        <w:rPr>
+          <w:rFonts w:ascii="Times New Roman" w:hAnsi="Times New Roman" w:cs="Times New Roman"/>
+          <w:b/>
+          <w:sz w:val="24"/>
+          <w:szCs w:val="24"/>
+        </w:rPr>
+        <w:t>68</w:t>
+      </w:r>
+      <w:r>
+        <w:rPr>
+          <w:rFonts w:ascii="Times New Roman" w:hAnsi="Times New Roman" w:cs="Times New Roman"/>
+          <w:b/>
+          <w:sz w:val="24"/>
+          <w:szCs w:val="24"/>
+        </w:rPr>
+        <w:t>,</w:t>
+      </w:r>
+      <w:r>
+        <w:rPr>
+          <w:rFonts w:ascii="Times New Roman" w:hAnsi="Times New Roman" w:cs="Times New Roman"/>
+          <w:b/>
+          <w:sz w:val="24"/>
+          <w:szCs w:val="24"/>
+        </w:rPr>
+        <w:t xml:space="preserve"> </w:t>
+      </w:r>
+      <w:r>
+        <w:rPr>
+          <w:rFonts w:ascii="Times New Roman" w:hAnsi="Times New Roman" w:cs="Times New Roman"/>
+          <w:b/>
+          <w:sz w:val="24"/>
+          <w:szCs w:val="24"/>
+        </w:rPr>
+        <w:t xml:space="preserve">was </w:t>
+      </w:r>
+      <w:r>
+        <w:rPr>
+          <w:rFonts w:ascii="Times New Roman" w:hAnsi="Times New Roman" w:cs="Times New Roman"/>
+          <w:b/>
+          <w:sz w:val="24"/>
+          <w:szCs w:val="24"/>
+        </w:rPr>
+        <w:t>born 26</w:t>
+      </w:r>
+      <w:r>
+        <w:rPr>
+          <w:rFonts w:ascii="Times New Roman" w:hAnsi="Times New Roman" w:cs="Times New Roman"/>
+          <w:b/>
+          <w:sz w:val="24"/>
+          <w:szCs w:val="24"/>
+        </w:rPr>
+        <w:t xml:space="preserve"> January 1913 </w:t>
+      </w:r>
+      <w:r>
+        <w:rPr>
+          <w:rFonts w:ascii="Times New Roman" w:hAnsi="Times New Roman" w:cs="Times New Roman"/>
+          <w:b/>
+          <w:sz w:val="24"/>
+          <w:szCs w:val="24"/>
+        </w:rPr>
+        <w:t>in London</w:t>
+      </w:r>
+      <w:r>
+        <w:rPr>
+          <w:rFonts w:ascii="Times New Roman" w:hAnsi="Times New Roman" w:cs="Times New Roman"/>
+          <w:b/>
+          <w:sz w:val="24"/>
+          <w:szCs w:val="24"/>
+        </w:rPr>
+        <w:t>, United Kingdom</w:t>
+      </w:r>
+      <w:r>
+        <w:rPr>
+          <w:rFonts w:ascii="Times New Roman" w:hAnsi="Times New Roman" w:cs="Times New Roman"/>
+          <w:b/>
+          <w:sz w:val="24"/>
+          <w:szCs w:val="24"/>
+        </w:rPr>
+        <w:t xml:space="preserve"> </w:t>
+      </w:r>
+      <w:r>
+        <w:rPr>
+          <w:rFonts w:ascii="Times New Roman" w:hAnsi="Times New Roman" w:cs="Times New Roman"/>
+          <w:b/>
+          <w:sz w:val="24"/>
+          <w:szCs w:val="24"/>
+        </w:rPr>
+        <w:t>and</w:t>
+      </w:r>
+      <w:r>
+        <w:rPr>
+          <w:rFonts w:ascii="Times New Roman" w:hAnsi="Times New Roman" w:cs="Times New Roman"/>
+          <w:b/>
+          <w:sz w:val="24"/>
+          <w:szCs w:val="24"/>
+        </w:rPr>
+        <w:t xml:space="preserve"> died 2</w:t>
+      </w:r>
+      <w:r>
+        <w:rPr>
+          <w:rFonts w:ascii="Times New Roman" w:hAnsi="Times New Roman" w:cs="Times New Roman"/>
+          <w:b/>
+          <w:sz w:val="24"/>
+          <w:szCs w:val="24"/>
+        </w:rPr>
+        <w:t>7 January 1980</w:t>
+      </w:r>
+      <w:r>
+        <w:rPr>
+          <w:rFonts w:ascii="Times New Roman" w:hAnsi="Times New Roman" w:cs="Times New Roman"/>
+          <w:b/>
+          <w:sz w:val="24"/>
+          <w:szCs w:val="24"/>
+        </w:rPr>
+        <w:t xml:space="preserve"> in </w:t>
+      </w:r>
+      <w:r>
+        <w:rPr>
+          <w:rFonts w:ascii="Times New Roman" w:hAnsi="Times New Roman" w:cs="Times New Roman"/>
+          <w:b/>
+          <w:sz w:val="24"/>
+          <w:szCs w:val="24"/>
+        </w:rPr>
+        <w:t xml:space="preserve">Ferney-Voltaire, </w:t>
+      </w:r>
+      <w:r>
+        <w:rPr>
+          <w:rFonts w:ascii="Times New Roman" w:hAnsi="Times New Roman" w:cs="Times New Roman"/>
+          <w:b/>
+          <w:sz w:val="24"/>
+          <w:szCs w:val="24"/>
+        </w:rPr>
+        <w:t>France.</w:t>
+      </w:r>
+      <w:r>
+        <w:rPr>
+          <w:rFonts w:ascii="Times New Roman" w:hAnsi="Times New Roman" w:cs="Times New Roman"/>
+          <w:b/>
+          <w:sz w:val="24"/>
+          <w:szCs w:val="24"/>
+        </w:rPr>
+        <w:t xml:space="preserve"> </w:t>
+      </w:r>
+      <w:r>
+        <w:rPr>
+          <w:rFonts w:ascii="Times New Roman" w:hAnsi="Times New Roman" w:cs="Times New Roman"/>
+          <w:b/>
+          <w:sz w:val="24"/>
+          <w:szCs w:val="24"/>
+        </w:rPr>
+        <w:t>He was the s</w:t>
+      </w:r>
+      <w:r>
+        <w:rPr>
+          <w:rFonts w:ascii="Times New Roman" w:hAnsi="Times New Roman" w:cs="Times New Roman"/>
+          <w:b/>
+          <w:sz w:val="24"/>
+          <w:szCs w:val="24"/>
+        </w:rPr>
+        <w:t>on of Henry Wyndham White</w:t>
+      </w:r>
+      <w:r>
+        <w:rPr>
+          <w:rFonts w:ascii="Times New Roman" w:hAnsi="Times New Roman" w:cs="Times New Roman"/>
+          <w:b/>
+          <w:sz w:val="24"/>
+          <w:szCs w:val="24"/>
+        </w:rPr>
+        <w:t xml:space="preserve">, </w:t>
+      </w:r>
+      <w:r>
+        <w:rPr>
+          <w:rFonts w:ascii="Times New Roman" w:hAnsi="Times New Roman" w:cs="Times New Roman"/>
+          <w:b/>
+          <w:sz w:val="24"/>
+          <w:szCs w:val="24"/>
+        </w:rPr>
+        <w:t>barrister-at-law</w:t>
+      </w:r>
+      <w:r>
+        <w:rPr>
+          <w:rFonts w:ascii="Times New Roman" w:hAnsi="Times New Roman" w:cs="Times New Roman"/>
+          <w:b/>
+          <w:sz w:val="24"/>
+          <w:szCs w:val="24"/>
+        </w:rPr>
+        <w:t>,</w:t>
+      </w:r>
+      <w:r>
+        <w:rPr>
+          <w:rFonts w:ascii="Times New Roman" w:hAnsi="Times New Roman" w:cs="Times New Roman"/>
+          <w:b/>
+          <w:sz w:val="24"/>
+          <w:szCs w:val="24"/>
+        </w:rPr>
+        <w:t xml:space="preserve"> and Helen </w:t>
+      </w:r>
+      <w:r>
+        <w:rPr>
+          <w:rFonts w:ascii="Times New Roman" w:hAnsi="Times New Roman" w:cs="Times New Roman"/>
+          <w:b/>
+          <w:sz w:val="24"/>
+          <w:szCs w:val="24"/>
+        </w:rPr>
+        <w:t>Peppiatt</w:t>
+      </w:r>
+      <w:r>
+        <w:rPr>
+          <w:rFonts w:ascii="Times New Roman" w:hAnsi="Times New Roman" w:cs="Times New Roman"/>
+          <w:b/>
+          <w:sz w:val="24"/>
+          <w:szCs w:val="24"/>
+        </w:rPr>
+        <w:t xml:space="preserve">. </w:t>
+      </w:r>
+      <w:r>
+        <w:rPr>
+          <w:rFonts w:ascii="Times New Roman" w:hAnsi="Times New Roman" w:cs="Times New Roman"/>
+          <w:b/>
+          <w:sz w:val="24"/>
+          <w:szCs w:val="24"/>
+        </w:rPr>
+        <w:t>On 12 November 1947 h</w:t>
+      </w:r>
+      <w:r>
+        <w:rPr>
+          <w:rFonts w:ascii="Times New Roman" w:hAnsi="Times New Roman" w:cs="Times New Roman"/>
+          <w:b/>
+          <w:sz w:val="24"/>
+          <w:szCs w:val="24"/>
+        </w:rPr>
+        <w:t xml:space="preserve">e married </w:t>
+      </w:r>
+      <w:r>
+        <w:rPr>
+          <w:rFonts w:ascii="Times New Roman" w:hAnsi="Times New Roman" w:cs="Times New Roman"/>
+          <w:b/>
+          <w:sz w:val="24"/>
+          <w:szCs w:val="24"/>
+        </w:rPr>
+        <w:t>Tina Gibson, American actress</w:t>
+      </w:r>
+      <w:r>
+        <w:rPr>
+          <w:rFonts w:ascii="Times New Roman" w:hAnsi="Times New Roman" w:cs="Times New Roman"/>
+          <w:b/>
+          <w:sz w:val="24"/>
+          <w:szCs w:val="24"/>
+        </w:rPr>
+        <w:t xml:space="preserve"> (professional name Tina Thayer)</w:t>
+      </w:r>
+      <w:r>
+        <w:rPr>
+          <w:rFonts w:ascii="Times New Roman" w:hAnsi="Times New Roman" w:cs="Times New Roman"/>
+          <w:b/>
+          <w:sz w:val="24"/>
+          <w:szCs w:val="24"/>
+        </w:rPr>
+        <w:t>, in New York City</w:t>
+      </w:r>
+      <w:r>
+        <w:rPr>
+          <w:rFonts w:ascii="Times New Roman" w:hAnsi="Times New Roman" w:cs="Times New Roman"/>
+          <w:b/>
+          <w:sz w:val="24"/>
+          <w:szCs w:val="24"/>
+        </w:rPr>
+        <w:t xml:space="preserve">. </w:t>
+      </w:r>
+      <w:r>
+        <w:rPr>
+          <w:rFonts w:ascii="Times New Roman" w:hAnsi="Times New Roman" w:cs="Times New Roman"/>
+          <w:b/>
+          <w:sz w:val="24"/>
+          <w:szCs w:val="24"/>
+        </w:rPr>
+        <w:t>They had two daughters and</w:t>
+      </w:r>
+      <w:r>
+        <w:rPr>
+          <w:rFonts w:ascii="Times New Roman" w:hAnsi="Times New Roman" w:cs="Times New Roman"/>
+          <w:b/>
+          <w:sz w:val="24"/>
+          <w:szCs w:val="24"/>
+        </w:rPr>
+        <w:t xml:space="preserve"> divorced</w:t>
+      </w:r>
+      <w:r>
+        <w:rPr>
+          <w:rFonts w:ascii="Times New Roman" w:hAnsi="Times New Roman" w:cs="Times New Roman"/>
+          <w:b/>
+          <w:sz w:val="24"/>
+          <w:szCs w:val="24"/>
+        </w:rPr>
+        <w:t xml:space="preserve"> </w:t>
+      </w:r>
+      <w:r>
+        <w:rPr>
+          <w:rFonts w:ascii="Times New Roman" w:hAnsi="Times New Roman" w:cs="Times New Roman"/>
+          <w:b/>
+          <w:sz w:val="24"/>
+          <w:szCs w:val="24"/>
+        </w:rPr>
+        <w:t>after 1964</w:t>
+      </w:r>
+      <w:r>
+        <w:rPr>
+          <w:rFonts w:ascii="Times New Roman" w:hAnsi="Times New Roman" w:cs="Times New Roman"/>
+          <w:b/>
+          <w:sz w:val="24"/>
+          <w:szCs w:val="24"/>
+        </w:rPr>
+        <w:t>.</w:t>
       </w:r>
     </w:p>
     <w:p>
@@ -111,25 +621,32 @@
         </w:rPr>
         <w:t xml:space="preserve">Source: </w:t>
       </w:r>
-      <w:hyperlink r:id="rId8" w:history="1">
-        <w:r>
-          <w:rPr>
-            <w:rStyle w:val="Hyperlink"/>
-            <w:rFonts w:ascii="Times New Roman" w:hAnsi="Times New Roman" w:cs="Times New Roman"/>
-            <w:sz w:val="24"/>
-            <w:szCs w:val="24"/>
-            <w:u w:val="none"/>
-          </w:rPr>
-          <w:t>www.wto.org/english/thewto_e/dg_e/ww_e.htm</w:t>
-        </w:r>
-      </w:hyperlink>
-      <w:r>
-        <w:rPr>
-          <w:rFonts w:ascii="Times New Roman" w:hAnsi="Times New Roman" w:cs="Times New Roman"/>
-          <w:sz w:val="24"/>
-          <w:szCs w:val="24"/>
-        </w:rPr>
-        <w:t xml:space="preserve"> </w:t>
+      <w:r>
+        <w:rPr>
+          <w:rFonts w:ascii="Times New Roman" w:hAnsi="Times New Roman" w:cs="Times New Roman"/>
+          <w:sz w:val="24"/>
+          <w:szCs w:val="24"/>
+          <w:lang w:val="en-GB"/>
+        </w:rPr>
+        <w:t>Wyndham White</w:t>
+      </w:r>
+      <w:r>
+        <w:rPr>
+          <w:rFonts w:ascii="Times New Roman" w:hAnsi="Times New Roman" w:cs="Times New Roman"/>
+          <w:sz w:val="24"/>
+          <w:szCs w:val="24"/>
+          <w:lang w:val="en-GB"/>
+        </w:rPr>
+        <w:t>,</w:t>
+      </w:r>
+      <w:r>
+        <w:rPr>
+          <w:rFonts w:ascii="Times New Roman" w:hAnsi="Times New Roman" w:cs="Times New Roman"/>
+          <w:sz w:val="24"/>
+          <w:szCs w:val="24"/>
+          <w:lang w:val="en-GB"/>
+        </w:rPr>
+        <w:t xml:space="preserve"> n.d., WTO</w:t>
       </w:r>
     </w:p>
     <w:p>
@@ -9664,7 +10181,7 @@
         </w:rPr>
         <w:t xml:space="preserve"> 1947-1994, </w:t>
       </w:r>
-      <w:hyperlink r:id="rId9" w:history="1">
+      <w:hyperlink r:id="rId8" w:history="1">
         <w:r>
           <w:rPr>
             <w:rStyle w:val="Hyperlink"/>
@@ -11573,7 +12090,7 @@
         </w:rPr>
         <w:t xml:space="preserve">: </w:t>
       </w:r>
-      <w:hyperlink r:id="rId10" w:history="1">
+      <w:hyperlink r:id="rId9" w:history="1">
         <w:r>
           <w:rPr>
             <w:rStyle w:val="Hyperlink"/>
@@ -11766,7 +12283,7 @@
         </w:rPr>
         <w:t xml:space="preserve">Eisenberg, </w:t>
       </w:r>
-      <w:hyperlink r:id="rId11" w:history="1">
+      <w:hyperlink r:id="rId10" w:history="1">
         <w:r>
           <w:rPr>
             <w:rStyle w:val="Hyperlink"/>
@@ -11799,9 +12316,9 @@
       </w:pPr>
     </w:p>
     <w:sectPr>
-      <w:headerReference w:type="even" r:id="rId12"/>
-      <w:headerReference w:type="default" r:id="rId13"/>
-      <w:footerReference w:type="default" r:id="rId14"/>
+      <w:headerReference w:type="even" r:id="rId11"/>
+      <w:headerReference w:type="default" r:id="rId12"/>
+      <w:footerReference w:type="default" r:id="rId13"/>
       <w:pgSz w:w="11901" w:h="16840"/>
       <w:pgMar w:top="1440" w:right="1440" w:bottom="1440" w:left="1440" w:header="720" w:footer="720" w:gutter="0"/>
       <w:cols w:space="720"/>
@@ -11812,7 +12329,7 @@
 </file>
 
 <file path=word/endnotes.xml><?xml version="1.0" encoding="utf-8"?>
-<w:endnotes xmlns:wpc="http://schemas.microsoft.com/office/word/2010/wordprocessingCanvas" xmlns:cx="http://schemas.microsoft.com/office/drawing/2014/chartex" xmlns:cx1="http://schemas.microsoft.com/office/drawing/2015/9/8/chartex" xmlns:cx2="http://schemas.microsoft.com/office/drawing/2015/10/21/chartex" xmlns:cx3="http://schemas.microsoft.com/office/drawing/2016/5/9/chartex" xmlns:cx4="http://schemas.microsoft.com/office/drawing/2016/5/10/chartex" xmlns:cx5="http://schemas.microsoft.com/office/drawing/2016/5/11/chartex" xmlns:cx6="http://schemas.microsoft.com/office/drawing/2016/5/12/chartex" xmlns:cx7="http://schemas.microsoft.com/office/drawing/2016/5/13/chartex" xmlns:cx8="http://schemas.microsoft.com/office/drawing/2016/5/14/chartex" xmlns:mc="http://schemas.openxmlformats.org/markup-compatibility/2006" xmlns:aink="http://schemas.microsoft.com/office/drawing/2016/ink" xmlns:am3d="http://schemas.microsoft.com/office/drawing/2017/model3d" xmlns:o="urn:schemas-microsoft-com:office:office" xmlns:oel="http://schemas.microsoft.com/office/2019/extlst" xmlns:r="http://schemas.openxmlformats.org/officeDocument/2006/relationships" xmlns:m="http://schemas.openxmlformats.org/officeDocument/2006/math" xmlns:v="urn:schemas-microsoft-com:vml" xmlns:wp14="http://schemas.microsoft.com/office/word/2010/wordprocessingDrawing" xmlns:wp="http://schemas.openxmlformats.org/drawingml/2006/wordprocessingDrawing" xmlns:w10="urn:schemas-microsoft-com:office:word" xmlns:w="http://schemas.openxmlformats.org/wordprocessingml/2006/main" xmlns:w14="http://schemas.microsoft.com/office/word/2010/wordml" xmlns:w15="http://schemas.microsoft.com/office/word/2012/wordml" xmlns:w16cex="http://schemas.microsoft.com/office/word/2018/wordml/cex" xmlns:w16cid="http://schemas.microsoft.com/office/word/2016/wordml/cid" xmlns:w16="http://schemas.microsoft.com/office/word/2018/wordml" xmlns:w16du="http://schemas.microsoft.com/office/word/2023/wordml/word16du" xmlns:w16sdtdh="http://schemas.microsoft.com/office/word/2020/wordml/sdtdatahash" xmlns:w16sdtfl="http://schemas.microsoft.com/office/word/2024/wordml/sdtformatlock" xmlns:w16se="http://schemas.microsoft.com/office/word/2015/wordml/symex" xmlns:wpg="http://schemas.microsoft.com/office/word/2010/wordprocessingGroup" xmlns:wpi="http://schemas.microsoft.com/office/word/2010/wordprocessingInk" xmlns:wne="http://schemas.microsoft.com/office/word/2006/wordml" xmlns:wps="http://schemas.microsoft.com/office/word/2010/wordprocessingShape" mc:Ignorable="w14 w15 w16se w16cid w16 w16cex w16sdtdh w16sdtfl w16du wp14">
+<w:endnotes xmlns:wpc="http://schemas.microsoft.com/office/word/2010/wordprocessingCanvas" xmlns:cx="http://schemas.microsoft.com/office/drawing/2014/chartex" xmlns:cx1="http://schemas.microsoft.com/office/drawing/2015/9/8/chartex" xmlns:cx2="http://schemas.microsoft.com/office/drawing/2015/10/21/chartex" xmlns:cx3="http://schemas.microsoft.com/office/drawing/2016/5/9/chartex" xmlns:cx4="http://schemas.microsoft.com/office/drawing/2016/5/10/chartex" xmlns:cx5="http://schemas.microsoft.com/office/drawing/2016/5/11/chartex" xmlns:cx6="http://schemas.microsoft.com/office/drawing/2016/5/12/chartex" xmlns:cx7="http://schemas.microsoft.com/office/drawing/2016/5/13/chartex" xmlns:cx8="http://schemas.microsoft.com/office/drawing/2016/5/14/chartex" xmlns:mc="http://schemas.openxmlformats.org/markup-compatibility/2006" xmlns:m="http://schemas.openxmlformats.org/officeDocument/2006/math" xmlns:aink="http://schemas.microsoft.com/office/drawing/2016/ink" xmlns:am3d="http://schemas.microsoft.com/office/drawing/2017/model3d" xmlns:oel="http://schemas.microsoft.com/office/2019/extlst" xmlns:r="http://schemas.openxmlformats.org/officeDocument/2006/relationships" xmlns:wp14="http://schemas.microsoft.com/office/word/2010/wordprocessingDrawing" xmlns:wp="http://schemas.openxmlformats.org/drawingml/2006/wordprocessingDrawing" xmlns:wpg="http://schemas.microsoft.com/office/word/2010/wordprocessingGroup" xmlns:wpi="http://schemas.microsoft.com/office/word/2010/wordprocessingInk" xmlns:wps="http://schemas.microsoft.com/office/word/2010/wordprocessingShape" xmlns:o="urn:schemas-microsoft-com:office:office" xmlns:v="urn:schemas-microsoft-com:vml" xmlns:w10="urn:schemas-microsoft-com:office:word" xmlns:w="http://schemas.openxmlformats.org/wordprocessingml/2006/main" xmlns:w14="http://schemas.microsoft.com/office/word/2010/wordml" xmlns:w15="http://schemas.microsoft.com/office/word/2012/wordml" xmlns:w16cei="http://schemas.microsoft.com/office/word/2026/wordml/cei" xmlns:w16cex="http://schemas.microsoft.com/office/word/2018/wordml/cex" xmlns:w16cid="http://schemas.microsoft.com/office/word/2016/wordml/cid" xmlns:w16="http://schemas.microsoft.com/office/word/2018/wordml" xmlns:w16sdtdh="http://schemas.microsoft.com/office/word/2020/wordml/sdtdatahash" xmlns:w16sdtfl="http://schemas.microsoft.com/office/word/2024/wordml/sdtformatlock" xmlns:w16se="http://schemas.microsoft.com/office/word/2015/wordml/symex" xmlns:w16du="http://schemas.microsoft.com/office/word/2023/wordml/word16du" xmlns:wne="http://schemas.microsoft.com/office/word/2006/wordml" mc:Ignorable="w14 w15 w16se w16cid w16 w16cex w16sdtdh w16sdtfl w16du wp14">
   <w:endnote w:type="separator" w:id="-1">
     <w:p>
       <w:pPr>
@@ -11837,7 +12354,7 @@
 </file>
 
 <file path=word/footer1.xml><?xml version="1.0" encoding="utf-8"?>
-<w:ftr xmlns:wpc="http://schemas.microsoft.com/office/word/2010/wordprocessingCanvas" xmlns:cx="http://schemas.microsoft.com/office/drawing/2014/chartex" xmlns:cx1="http://schemas.microsoft.com/office/drawing/2015/9/8/chartex" xmlns:cx2="http://schemas.microsoft.com/office/drawing/2015/10/21/chartex" xmlns:cx3="http://schemas.microsoft.com/office/drawing/2016/5/9/chartex" xmlns:cx4="http://schemas.microsoft.com/office/drawing/2016/5/10/chartex" xmlns:cx5="http://schemas.microsoft.com/office/drawing/2016/5/11/chartex" xmlns:cx6="http://schemas.microsoft.com/office/drawing/2016/5/12/chartex" xmlns:cx7="http://schemas.microsoft.com/office/drawing/2016/5/13/chartex" xmlns:cx8="http://schemas.microsoft.com/office/drawing/2016/5/14/chartex" xmlns:mc="http://schemas.openxmlformats.org/markup-compatibility/2006" xmlns:aink="http://schemas.microsoft.com/office/drawing/2016/ink" xmlns:am3d="http://schemas.microsoft.com/office/drawing/2017/model3d" xmlns:o="urn:schemas-microsoft-com:office:office" xmlns:oel="http://schemas.microsoft.com/office/2019/extlst" xmlns:r="http://schemas.openxmlformats.org/officeDocument/2006/relationships" xmlns:m="http://schemas.openxmlformats.org/officeDocument/2006/math" xmlns:v="urn:schemas-microsoft-com:vml" xmlns:wp14="http://schemas.microsoft.com/office/word/2010/wordprocessingDrawing" xmlns:wp="http://schemas.openxmlformats.org/drawingml/2006/wordprocessingDrawing" xmlns:w10="urn:schemas-microsoft-com:office:word" xmlns:w="http://schemas.openxmlformats.org/wordprocessingml/2006/main" xmlns:w14="http://schemas.microsoft.com/office/word/2010/wordml" xmlns:w15="http://schemas.microsoft.com/office/word/2012/wordml" xmlns:w16cex="http://schemas.microsoft.com/office/word/2018/wordml/cex" xmlns:w16cid="http://schemas.microsoft.com/office/word/2016/wordml/cid" xmlns:w16="http://schemas.microsoft.com/office/word/2018/wordml" xmlns:w16du="http://schemas.microsoft.com/office/word/2023/wordml/word16du" xmlns:w16sdtdh="http://schemas.microsoft.com/office/word/2020/wordml/sdtdatahash" xmlns:w16sdtfl="http://schemas.microsoft.com/office/word/2024/wordml/sdtformatlock" xmlns:w16se="http://schemas.microsoft.com/office/word/2015/wordml/symex" xmlns:wpg="http://schemas.microsoft.com/office/word/2010/wordprocessingGroup" xmlns:wpi="http://schemas.microsoft.com/office/word/2010/wordprocessingInk" xmlns:wne="http://schemas.microsoft.com/office/word/2006/wordml" xmlns:wps="http://schemas.microsoft.com/office/word/2010/wordprocessingShape" mc:Ignorable="w14 w15 w16se w16cid w16 w16cex w16sdtdh w16sdtfl w16du wp14">
+<w:ftr xmlns:wpc="http://schemas.microsoft.com/office/word/2010/wordprocessingCanvas" xmlns:cx="http://schemas.microsoft.com/office/drawing/2014/chartex" xmlns:cx1="http://schemas.microsoft.com/office/drawing/2015/9/8/chartex" xmlns:cx2="http://schemas.microsoft.com/office/drawing/2015/10/21/chartex" xmlns:cx3="http://schemas.microsoft.com/office/drawing/2016/5/9/chartex" xmlns:cx4="http://schemas.microsoft.com/office/drawing/2016/5/10/chartex" xmlns:cx5="http://schemas.microsoft.com/office/drawing/2016/5/11/chartex" xmlns:cx6="http://schemas.microsoft.com/office/drawing/2016/5/12/chartex" xmlns:cx7="http://schemas.microsoft.com/office/drawing/2016/5/13/chartex" xmlns:cx8="http://schemas.microsoft.com/office/drawing/2016/5/14/chartex" xmlns:mc="http://schemas.openxmlformats.org/markup-compatibility/2006" xmlns:m="http://schemas.openxmlformats.org/officeDocument/2006/math" xmlns:aink="http://schemas.microsoft.com/office/drawing/2016/ink" xmlns:am3d="http://schemas.microsoft.com/office/drawing/2017/model3d" xmlns:oel="http://schemas.microsoft.com/office/2019/extlst" xmlns:r="http://schemas.openxmlformats.org/officeDocument/2006/relationships" xmlns:wp14="http://schemas.microsoft.com/office/word/2010/wordprocessingDrawing" xmlns:wp="http://schemas.openxmlformats.org/drawingml/2006/wordprocessingDrawing" xmlns:wpg="http://schemas.microsoft.com/office/word/2010/wordprocessingGroup" xmlns:wpi="http://schemas.microsoft.com/office/word/2010/wordprocessingInk" xmlns:wps="http://schemas.microsoft.com/office/word/2010/wordprocessingShape" xmlns:o="urn:schemas-microsoft-com:office:office" xmlns:v="urn:schemas-microsoft-com:vml" xmlns:w10="urn:schemas-microsoft-com:office:word" xmlns:w="http://schemas.openxmlformats.org/wordprocessingml/2006/main" xmlns:w14="http://schemas.microsoft.com/office/word/2010/wordml" xmlns:w15="http://schemas.microsoft.com/office/word/2012/wordml" xmlns:w16cei="http://schemas.microsoft.com/office/word/2026/wordml/cei" xmlns:w16cex="http://schemas.microsoft.com/office/word/2018/wordml/cex" xmlns:w16cid="http://schemas.microsoft.com/office/word/2016/wordml/cid" xmlns:w16="http://schemas.microsoft.com/office/word/2018/wordml" xmlns:w16sdtdh="http://schemas.microsoft.com/office/word/2020/wordml/sdtdatahash" xmlns:w16sdtfl="http://schemas.microsoft.com/office/word/2024/wordml/sdtformatlock" xmlns:w16se="http://schemas.microsoft.com/office/word/2015/wordml/symex" xmlns:w16du="http://schemas.microsoft.com/office/word/2023/wordml/word16du" xmlns:wne="http://schemas.microsoft.com/office/word/2006/wordml" mc:Ignorable="w14 w15 w16se w16cid w16 w16cex w16sdtdh w16sdtfl w16du wp14">
   <w:p>
     <w:pPr>
       <w:pStyle w:val="Voettekst"/>
@@ -11910,7 +12427,7 @@
 </file>
 
 <file path=word/footnotes.xml><?xml version="1.0" encoding="utf-8"?>
-<w:footnotes xmlns:wpc="http://schemas.microsoft.com/office/word/2010/wordprocessingCanvas" xmlns:cx="http://schemas.microsoft.com/office/drawing/2014/chartex" xmlns:cx1="http://schemas.microsoft.com/office/drawing/2015/9/8/chartex" xmlns:cx2="http://schemas.microsoft.com/office/drawing/2015/10/21/chartex" xmlns:cx3="http://schemas.microsoft.com/office/drawing/2016/5/9/chartex" xmlns:cx4="http://schemas.microsoft.com/office/drawing/2016/5/10/chartex" xmlns:cx5="http://schemas.microsoft.com/office/drawing/2016/5/11/chartex" xmlns:cx6="http://schemas.microsoft.com/office/drawing/2016/5/12/chartex" xmlns:cx7="http://schemas.microsoft.com/office/drawing/2016/5/13/chartex" xmlns:cx8="http://schemas.microsoft.com/office/drawing/2016/5/14/chartex" xmlns:mc="http://schemas.openxmlformats.org/markup-compatibility/2006" xmlns:aink="http://schemas.microsoft.com/office/drawing/2016/ink" xmlns:am3d="http://schemas.microsoft.com/office/drawing/2017/model3d" xmlns:o="urn:schemas-microsoft-com:office:office" xmlns:oel="http://schemas.microsoft.com/office/2019/extlst" xmlns:r="http://schemas.openxmlformats.org/officeDocument/2006/relationships" xmlns:m="http://schemas.openxmlformats.org/officeDocument/2006/math" xmlns:v="urn:schemas-microsoft-com:vml" xmlns:wp14="http://schemas.microsoft.com/office/word/2010/wordprocessingDrawing" xmlns:wp="http://schemas.openxmlformats.org/drawingml/2006/wordprocessingDrawing" xmlns:w10="urn:schemas-microsoft-com:office:word" xmlns:w="http://schemas.openxmlformats.org/wordprocessingml/2006/main" xmlns:w14="http://schemas.microsoft.com/office/word/2010/wordml" xmlns:w15="http://schemas.microsoft.com/office/word/2012/wordml" xmlns:w16cex="http://schemas.microsoft.com/office/word/2018/wordml/cex" xmlns:w16cid="http://schemas.microsoft.com/office/word/2016/wordml/cid" xmlns:w16="http://schemas.microsoft.com/office/word/2018/wordml" xmlns:w16du="http://schemas.microsoft.com/office/word/2023/wordml/word16du" xmlns:w16sdtdh="http://schemas.microsoft.com/office/word/2020/wordml/sdtdatahash" xmlns:w16sdtfl="http://schemas.microsoft.com/office/word/2024/wordml/sdtformatlock" xmlns:w16se="http://schemas.microsoft.com/office/word/2015/wordml/symex" xmlns:wpg="http://schemas.microsoft.com/office/word/2010/wordprocessingGroup" xmlns:wpi="http://schemas.microsoft.com/office/word/2010/wordprocessingInk" xmlns:wne="http://schemas.microsoft.com/office/word/2006/wordml" xmlns:wps="http://schemas.microsoft.com/office/word/2010/wordprocessingShape" mc:Ignorable="w14 w15 w16se w16cid w16 w16cex w16sdtdh w16sdtfl w16du wp14">
+<w:footnotes xmlns:wpc="http://schemas.microsoft.com/office/word/2010/wordprocessingCanvas" xmlns:cx="http://schemas.microsoft.com/office/drawing/2014/chartex" xmlns:cx1="http://schemas.microsoft.com/office/drawing/2015/9/8/chartex" xmlns:cx2="http://schemas.microsoft.com/office/drawing/2015/10/21/chartex" xmlns:cx3="http://schemas.microsoft.com/office/drawing/2016/5/9/chartex" xmlns:cx4="http://schemas.microsoft.com/office/drawing/2016/5/10/chartex" xmlns:cx5="http://schemas.microsoft.com/office/drawing/2016/5/11/chartex" xmlns:cx6="http://schemas.microsoft.com/office/drawing/2016/5/12/chartex" xmlns:cx7="http://schemas.microsoft.com/office/drawing/2016/5/13/chartex" xmlns:cx8="http://schemas.microsoft.com/office/drawing/2016/5/14/chartex" xmlns:mc="http://schemas.openxmlformats.org/markup-compatibility/2006" xmlns:m="http://schemas.openxmlformats.org/officeDocument/2006/math" xmlns:aink="http://schemas.microsoft.com/office/drawing/2016/ink" xmlns:am3d="http://schemas.microsoft.com/office/drawing/2017/model3d" xmlns:oel="http://schemas.microsoft.com/office/2019/extlst" xmlns:r="http://schemas.openxmlformats.org/officeDocument/2006/relationships" xmlns:wp14="http://schemas.microsoft.com/office/word/2010/wordprocessingDrawing" xmlns:wp="http://schemas.openxmlformats.org/drawingml/2006/wordprocessingDrawing" xmlns:wpg="http://schemas.microsoft.com/office/word/2010/wordprocessingGroup" xmlns:wpi="http://schemas.microsoft.com/office/word/2010/wordprocessingInk" xmlns:wps="http://schemas.microsoft.com/office/word/2010/wordprocessingShape" xmlns:o="urn:schemas-microsoft-com:office:office" xmlns:v="urn:schemas-microsoft-com:vml" xmlns:w10="urn:schemas-microsoft-com:office:word" xmlns:w="http://schemas.openxmlformats.org/wordprocessingml/2006/main" xmlns:w14="http://schemas.microsoft.com/office/word/2010/wordml" xmlns:w15="http://schemas.microsoft.com/office/word/2012/wordml" xmlns:w16cei="http://schemas.microsoft.com/office/word/2026/wordml/cei" xmlns:w16cex="http://schemas.microsoft.com/office/word/2018/wordml/cex" xmlns:w16cid="http://schemas.microsoft.com/office/word/2016/wordml/cid" xmlns:w16="http://schemas.microsoft.com/office/word/2018/wordml" xmlns:w16sdtdh="http://schemas.microsoft.com/office/word/2020/wordml/sdtdatahash" xmlns:w16sdtfl="http://schemas.microsoft.com/office/word/2024/wordml/sdtformatlock" xmlns:w16se="http://schemas.microsoft.com/office/word/2015/wordml/symex" xmlns:w16du="http://schemas.microsoft.com/office/word/2023/wordml/word16du" xmlns:wne="http://schemas.microsoft.com/office/word/2006/wordml" mc:Ignorable="w14 w15 w16se w16cid w16 w16cex w16sdtdh w16sdtfl w16du wp14">
   <w:footnote w:type="separator" w:id="-1">
     <w:p>
       <w:pPr>
@@ -11935,7 +12452,7 @@
 </file>
 
 <file path=word/header1.xml><?xml version="1.0" encoding="utf-8"?>
-<w:hdr xmlns:wpc="http://schemas.microsoft.com/office/word/2010/wordprocessingCanvas" xmlns:cx="http://schemas.microsoft.com/office/drawing/2014/chartex" xmlns:cx1="http://schemas.microsoft.com/office/drawing/2015/9/8/chartex" xmlns:cx2="http://schemas.microsoft.com/office/drawing/2015/10/21/chartex" xmlns:cx3="http://schemas.microsoft.com/office/drawing/2016/5/9/chartex" xmlns:cx4="http://schemas.microsoft.com/office/drawing/2016/5/10/chartex" xmlns:cx5="http://schemas.microsoft.com/office/drawing/2016/5/11/chartex" xmlns:cx6="http://schemas.microsoft.com/office/drawing/2016/5/12/chartex" xmlns:cx7="http://schemas.microsoft.com/office/drawing/2016/5/13/chartex" xmlns:cx8="http://schemas.microsoft.com/office/drawing/2016/5/14/chartex" xmlns:mc="http://schemas.openxmlformats.org/markup-compatibility/2006" xmlns:aink="http://schemas.microsoft.com/office/drawing/2016/ink" xmlns:am3d="http://schemas.microsoft.com/office/drawing/2017/model3d" xmlns:o="urn:schemas-microsoft-com:office:office" xmlns:oel="http://schemas.microsoft.com/office/2019/extlst" xmlns:r="http://schemas.openxmlformats.org/officeDocument/2006/relationships" xmlns:m="http://schemas.openxmlformats.org/officeDocument/2006/math" xmlns:v="urn:schemas-microsoft-com:vml" xmlns:wp14="http://schemas.microsoft.com/office/word/2010/wordprocessingDrawing" xmlns:wp="http://schemas.openxmlformats.org/drawingml/2006/wordprocessingDrawing" xmlns:w10="urn:schemas-microsoft-com:office:word" xmlns:w="http://schemas.openxmlformats.org/wordprocessingml/2006/main" xmlns:w14="http://schemas.microsoft.com/office/word/2010/wordml" xmlns:w15="http://schemas.microsoft.com/office/word/2012/wordml" xmlns:w16cex="http://schemas.microsoft.com/office/word/2018/wordml/cex" xmlns:w16cid="http://schemas.microsoft.com/office/word/2016/wordml/cid" xmlns:w16="http://schemas.microsoft.com/office/word/2018/wordml" xmlns:w16du="http://schemas.microsoft.com/office/word/2023/wordml/word16du" xmlns:w16sdtdh="http://schemas.microsoft.com/office/word/2020/wordml/sdtdatahash" xmlns:w16sdtfl="http://schemas.microsoft.com/office/word/2024/wordml/sdtformatlock" xmlns:w16se="http://schemas.microsoft.com/office/word/2015/wordml/symex" xmlns:wpg="http://schemas.microsoft.com/office/word/2010/wordprocessingGroup" xmlns:wpi="http://schemas.microsoft.com/office/word/2010/wordprocessingInk" xmlns:wne="http://schemas.microsoft.com/office/word/2006/wordml" xmlns:wps="http://schemas.microsoft.com/office/word/2010/wordprocessingShape" mc:Ignorable="w14 w15 w16se w16cid w16 w16cex w16sdtdh w16sdtfl w16du wp14">
+<w:hdr xmlns:wpc="http://schemas.microsoft.com/office/word/2010/wordprocessingCanvas" xmlns:cx="http://schemas.microsoft.com/office/drawing/2014/chartex" xmlns:cx1="http://schemas.microsoft.com/office/drawing/2015/9/8/chartex" xmlns:cx2="http://schemas.microsoft.com/office/drawing/2015/10/21/chartex" xmlns:cx3="http://schemas.microsoft.com/office/drawing/2016/5/9/chartex" xmlns:cx4="http://schemas.microsoft.com/office/drawing/2016/5/10/chartex" xmlns:cx5="http://schemas.microsoft.com/office/drawing/2016/5/11/chartex" xmlns:cx6="http://schemas.microsoft.com/office/drawing/2016/5/12/chartex" xmlns:cx7="http://schemas.microsoft.com/office/drawing/2016/5/13/chartex" xmlns:cx8="http://schemas.microsoft.com/office/drawing/2016/5/14/chartex" xmlns:mc="http://schemas.openxmlformats.org/markup-compatibility/2006" xmlns:m="http://schemas.openxmlformats.org/officeDocument/2006/math" xmlns:aink="http://schemas.microsoft.com/office/drawing/2016/ink" xmlns:am3d="http://schemas.microsoft.com/office/drawing/2017/model3d" xmlns:oel="http://schemas.microsoft.com/office/2019/extlst" xmlns:r="http://schemas.openxmlformats.org/officeDocument/2006/relationships" xmlns:wp14="http://schemas.microsoft.com/office/word/2010/wordprocessingDrawing" xmlns:wp="http://schemas.openxmlformats.org/drawingml/2006/wordprocessingDrawing" xmlns:wpg="http://schemas.microsoft.com/office/word/2010/wordprocessingGroup" xmlns:wpi="http://schemas.microsoft.com/office/word/2010/wordprocessingInk" xmlns:wps="http://schemas.microsoft.com/office/word/2010/wordprocessingShape" xmlns:o="urn:schemas-microsoft-com:office:office" xmlns:v="urn:schemas-microsoft-com:vml" xmlns:w10="urn:schemas-microsoft-com:office:word" xmlns:w="http://schemas.openxmlformats.org/wordprocessingml/2006/main" xmlns:w14="http://schemas.microsoft.com/office/word/2010/wordml" xmlns:w15="http://schemas.microsoft.com/office/word/2012/wordml" xmlns:w16cei="http://schemas.microsoft.com/office/word/2026/wordml/cei" xmlns:w16cex="http://schemas.microsoft.com/office/word/2018/wordml/cex" xmlns:w16cid="http://schemas.microsoft.com/office/word/2016/wordml/cid" xmlns:w16="http://schemas.microsoft.com/office/word/2018/wordml" xmlns:w16sdtdh="http://schemas.microsoft.com/office/word/2020/wordml/sdtdatahash" xmlns:w16sdtfl="http://schemas.microsoft.com/office/word/2024/wordml/sdtformatlock" xmlns:w16se="http://schemas.microsoft.com/office/word/2015/wordml/symex" xmlns:w16du="http://schemas.microsoft.com/office/word/2023/wordml/word16du" xmlns:wne="http://schemas.microsoft.com/office/word/2006/wordml" mc:Ignorable="w14 w15 w16se w16cid w16 w16cex w16sdtdh w16sdtfl w16du wp14">
   <w:p>
     <w:pPr>
       <w:pStyle w:val="Koptekst"/>
@@ -11973,7 +12490,7 @@
 </file>
 
 <file path=word/header2.xml><?xml version="1.0" encoding="utf-8"?>
-<w:hdr xmlns:wpc="http://schemas.microsoft.com/office/word/2010/wordprocessingCanvas" xmlns:cx="http://schemas.microsoft.com/office/drawing/2014/chartex" xmlns:cx1="http://schemas.microsoft.com/office/drawing/2015/9/8/chartex" xmlns:cx2="http://schemas.microsoft.com/office/drawing/2015/10/21/chartex" xmlns:cx3="http://schemas.microsoft.com/office/drawing/2016/5/9/chartex" xmlns:cx4="http://schemas.microsoft.com/office/drawing/2016/5/10/chartex" xmlns:cx5="http://schemas.microsoft.com/office/drawing/2016/5/11/chartex" xmlns:cx6="http://schemas.microsoft.com/office/drawing/2016/5/12/chartex" xmlns:cx7="http://schemas.microsoft.com/office/drawing/2016/5/13/chartex" xmlns:cx8="http://schemas.microsoft.com/office/drawing/2016/5/14/chartex" xmlns:mc="http://schemas.openxmlformats.org/markup-compatibility/2006" xmlns:aink="http://schemas.microsoft.com/office/drawing/2016/ink" xmlns:am3d="http://schemas.microsoft.com/office/drawing/2017/model3d" xmlns:o="urn:schemas-microsoft-com:office:office" xmlns:oel="http://schemas.microsoft.com/office/2019/extlst" xmlns:r="http://schemas.openxmlformats.org/officeDocument/2006/relationships" xmlns:m="http://schemas.openxmlformats.org/officeDocument/2006/math" xmlns:v="urn:schemas-microsoft-com:vml" xmlns:wp14="http://schemas.microsoft.com/office/word/2010/wordprocessingDrawing" xmlns:wp="http://schemas.openxmlformats.org/drawingml/2006/wordprocessingDrawing" xmlns:w10="urn:schemas-microsoft-com:office:word" xmlns:w="http://schemas.openxmlformats.org/wordprocessingml/2006/main" xmlns:w14="http://schemas.microsoft.com/office/word/2010/wordml" xmlns:w15="http://schemas.microsoft.com/office/word/2012/wordml" xmlns:w16cex="http://schemas.microsoft.com/office/word/2018/wordml/cex" xmlns:w16cid="http://schemas.microsoft.com/office/word/2016/wordml/cid" xmlns:w16="http://schemas.microsoft.com/office/word/2018/wordml" xmlns:w16du="http://schemas.microsoft.com/office/word/2023/wordml/word16du" xmlns:w16sdtdh="http://schemas.microsoft.com/office/word/2020/wordml/sdtdatahash" xmlns:w16sdtfl="http://schemas.microsoft.com/office/word/2024/wordml/sdtformatlock" xmlns:w16se="http://schemas.microsoft.com/office/word/2015/wordml/symex" xmlns:wpg="http://schemas.microsoft.com/office/word/2010/wordprocessingGroup" xmlns:wpi="http://schemas.microsoft.com/office/word/2010/wordprocessingInk" xmlns:wne="http://schemas.microsoft.com/office/word/2006/wordml" xmlns:wps="http://schemas.microsoft.com/office/word/2010/wordprocessingShape" mc:Ignorable="w14 w15 w16se w16cid w16 w16cex w16sdtdh w16sdtfl w16du wp14">
+<w:hdr xmlns:wpc="http://schemas.microsoft.com/office/word/2010/wordprocessingCanvas" xmlns:cx="http://schemas.microsoft.com/office/drawing/2014/chartex" xmlns:cx1="http://schemas.microsoft.com/office/drawing/2015/9/8/chartex" xmlns:cx2="http://schemas.microsoft.com/office/drawing/2015/10/21/chartex" xmlns:cx3="http://schemas.microsoft.com/office/drawing/2016/5/9/chartex" xmlns:cx4="http://schemas.microsoft.com/office/drawing/2016/5/10/chartex" xmlns:cx5="http://schemas.microsoft.com/office/drawing/2016/5/11/chartex" xmlns:cx6="http://schemas.microsoft.com/office/drawing/2016/5/12/chartex" xmlns:cx7="http://schemas.microsoft.com/office/drawing/2016/5/13/chartex" xmlns:cx8="http://schemas.microsoft.com/office/drawing/2016/5/14/chartex" xmlns:mc="http://schemas.openxmlformats.org/markup-compatibility/2006" xmlns:m="http://schemas.openxmlformats.org/officeDocument/2006/math" xmlns:aink="http://schemas.microsoft.com/office/drawing/2016/ink" xmlns:am3d="http://schemas.microsoft.com/office/drawing/2017/model3d" xmlns:oel="http://schemas.microsoft.com/office/2019/extlst" xmlns:r="http://schemas.openxmlformats.org/officeDocument/2006/relationships" xmlns:wp14="http://schemas.microsoft.com/office/word/2010/wordprocessingDrawing" xmlns:wp="http://schemas.openxmlformats.org/drawingml/2006/wordprocessingDrawing" xmlns:wpg="http://schemas.microsoft.com/office/word/2010/wordprocessingGroup" xmlns:wpi="http://schemas.microsoft.com/office/word/2010/wordprocessingInk" xmlns:wps="http://schemas.microsoft.com/office/word/2010/wordprocessingShape" xmlns:o="urn:schemas-microsoft-com:office:office" xmlns:v="urn:schemas-microsoft-com:vml" xmlns:w10="urn:schemas-microsoft-com:office:word" xmlns:w="http://schemas.openxmlformats.org/wordprocessingml/2006/main" xmlns:w14="http://schemas.microsoft.com/office/word/2010/wordml" xmlns:w15="http://schemas.microsoft.com/office/word/2012/wordml" xmlns:w16cei="http://schemas.microsoft.com/office/word/2026/wordml/cei" xmlns:w16cex="http://schemas.microsoft.com/office/word/2018/wordml/cex" xmlns:w16cid="http://schemas.microsoft.com/office/word/2016/wordml/cid" xmlns:w16="http://schemas.microsoft.com/office/word/2018/wordml" xmlns:w16sdtdh="http://schemas.microsoft.com/office/word/2020/wordml/sdtdatahash" xmlns:w16sdtfl="http://schemas.microsoft.com/office/word/2024/wordml/sdtformatlock" xmlns:w16se="http://schemas.microsoft.com/office/word/2015/wordml/symex" xmlns:w16du="http://schemas.microsoft.com/office/word/2023/wordml/word16du" xmlns:wne="http://schemas.microsoft.com/office/word/2006/wordml" mc:Ignorable="w14 w15 w16se w16cid w16 w16cex w16sdtdh w16sdtfl w16du wp14">
   <w:p>
     <w:pPr>
       <w:pStyle w:val="Koptekst"/>
@@ -12034,7 +12551,7 @@
 </file>
 
 <file path=word/styles.xml><?xml version="1.0" encoding="utf-8"?>
-<w:styles xmlns:mc="http://schemas.openxmlformats.org/markup-compatibility/2006" xmlns:r="http://schemas.openxmlformats.org/officeDocument/2006/relationships" xmlns:w="http://schemas.openxmlformats.org/wordprocessingml/2006/main" xmlns:w14="http://schemas.microsoft.com/office/word/2010/wordml" xmlns:w15="http://schemas.microsoft.com/office/word/2012/wordml" xmlns:w16cex="http://schemas.microsoft.com/office/word/2018/wordml/cex" xmlns:w16cid="http://schemas.microsoft.com/office/word/2016/wordml/cid" xmlns:w16="http://schemas.microsoft.com/office/word/2018/wordml" xmlns:w16du="http://schemas.microsoft.com/office/word/2023/wordml/word16du" xmlns:w16sdtdh="http://schemas.microsoft.com/office/word/2020/wordml/sdtdatahash" xmlns:w16sdtfl="http://schemas.microsoft.com/office/word/2024/wordml/sdtformatlock" xmlns:w16se="http://schemas.microsoft.com/office/word/2015/wordml/symex" mc:Ignorable="w14 w15 w16se w16cid w16 w16cex w16sdtdh w16sdtfl w16du">
+<w:styles xmlns:mc="http://schemas.openxmlformats.org/markup-compatibility/2006" xmlns:r="http://schemas.openxmlformats.org/officeDocument/2006/relationships" xmlns:w="http://schemas.openxmlformats.org/wordprocessingml/2006/main" xmlns:w14="http://schemas.microsoft.com/office/word/2010/wordml" xmlns:w15="http://schemas.microsoft.com/office/word/2012/wordml" xmlns:w16cex="http://schemas.microsoft.com/office/word/2018/wordml/cex" xmlns:w16cid="http://schemas.microsoft.com/office/word/2016/wordml/cid" xmlns:w16="http://schemas.microsoft.com/office/word/2018/wordml" xmlns:w16sdtdh="http://schemas.microsoft.com/office/word/2020/wordml/sdtdatahash" xmlns:w16sdtfl="http://schemas.microsoft.com/office/word/2024/wordml/sdtformatlock" xmlns:w16se="http://schemas.microsoft.com/office/word/2015/wordml/symex" xmlns:w16du="http://schemas.microsoft.com/office/word/2023/wordml/word16du" mc:Ignorable="w14 w15 w16se w16cid w16 w16cex w16sdtdh w16sdtfl w16du">
   <w:docDefaults>
     <w:rPrDefault>
       <w:rPr>

</xml_diff>